<commit_message>
V2: fold the diesel-hybrid demonstration into both reports
Adds Section 19 to technical_report.md covering the diesel-hybrid
follow-on (motivation, config changes, the six-load-level sweep that
found 4.5 GWh/year, results table, all 4 new figures embedded inline,
and the renewable-share-vs-LCOE "where does it stop paying for itself"
analysis), with a forward-reference added to the Introduction. Also
fixes a pre-existing bug in the Introduction's own text ("Section 15"
should have read "Section 9" for the off-grid decision).

Adds a plain-language "what if we add a backup generator" section to
decision_maker_report.md covering the same ground.

Re-exported both reports to PDF and Word (technical_report.docx now
includes all 14 figures across both the off-grid study and the
diesel-hybrid demonstration). Full 177-test suite still green.
</commit_message>
<xml_diff>
--- a/v2/reports/exports/decision_maker_report.docx
+++ b/v2/reports/exports/decision_maker_report.docx
@@ -2,7 +2,7 @@
 <file path=word/document.xml><?xml version="1.0" encoding="utf-8"?>
 <w:document xmlns:w="http://schemas.openxmlformats.org/wordprocessingml/2006/main" xmlns:m="http://schemas.openxmlformats.org/officeDocument/2006/math" xmlns:r="http://schemas.openxmlformats.org/officeDocument/2006/relationships" xmlns:o="urn:schemas-microsoft-com:office:office" xmlns:v="urn:schemas-microsoft-com:vml" xmlns:w10="urn:schemas-microsoft-com:office:word" xmlns:a="http://schemas.openxmlformats.org/drawingml/2006/main" xmlns:pic="http://schemas.openxmlformats.org/drawingml/2006/picture" xmlns:wp="http://schemas.openxmlformats.org/drawingml/2006/wordprocessingDrawing">
   <w:body>
-    <w:bookmarkStart w:id="24" w:name="X05d2e10c353131b9e9da8e3195e33467aade62f"/>
+    <w:bookmarkStart w:id="25" w:name="X05d2e10c353131b9e9da8e3195e33467aade62f"/>
     <w:p>
       <w:pPr>
         <w:pStyle w:val="Heading1"/>
@@ -889,7 +889,229 @@
       </w:r>
     </w:p>
     <w:bookmarkEnd w:id="23"/>
+    <w:bookmarkStart w:id="24" w:name="Xe8c91f04e1b145ce64799a22d2d3a5b5a4bd2dc"/>
+    <w:p>
+      <w:pPr>
+        <w:pStyle w:val="Heading2"/>
+      </w:pPr>
+      <w:r>
+        <w:t xml:space="preserve">A follow-on question: what if we add a backup generator?</w:t>
+      </w:r>
+    </w:p>
+    <w:p>
+      <w:pPr>
+        <w:pStyle w:val="FirstParagraph"/>
+      </w:pPr>
+      <w:r>
+        <w:t xml:space="preserve">Everything above describes a fully off-grid system — no backup generator,</w:t>
+      </w:r>
+      <w:r>
+        <w:t xml:space="preserve"> </w:t>
+      </w:r>
+      <w:r>
+        <w:t xml:space="preserve">so the battery has to be big enough to survive every bad week on its own.</w:t>
+      </w:r>
+      <w:r>
+        <w:t xml:space="preserve"> </w:t>
+      </w:r>
+      <w:r>
+        <w:t xml:space="preserve">That’s why the solar and wind panels had to be built so much larger than</w:t>
+      </w:r>
+      <w:r>
+        <w:t xml:space="preserve"> </w:t>
+      </w:r>
+      <w:r>
+        <w:t xml:space="preserve">the actual demand: about 60% of all the power they generated over the</w:t>
+      </w:r>
+      <w:r>
+        <w:t xml:space="preserve"> </w:t>
+      </w:r>
+      <w:r>
+        <w:t xml:space="preserve">year was simply thrown away (curtailed), because there was nowhere to put</w:t>
+      </w:r>
+      <w:r>
+        <w:t xml:space="preserve"> </w:t>
+      </w:r>
+      <w:r>
+        <w:t xml:space="preserve">it once the battery was full.</w:t>
+      </w:r>
+    </w:p>
+    <w:p>
+      <w:pPr>
+        <w:pStyle w:val="BodyText"/>
+      </w:pPr>
+      <w:r>
+        <w:t xml:space="preserve">As a follow-on check, we turned the diesel backup generator on and</w:t>
+      </w:r>
+      <w:r>
+        <w:t xml:space="preserve"> </w:t>
+      </w:r>
+      <w:r>
+        <w:t xml:space="preserve">increased the electricity demand so it’s better matched to what the solar</w:t>
+      </w:r>
+      <w:r>
+        <w:t xml:space="preserve"> </w:t>
+      </w:r>
+      <w:r>
+        <w:t xml:space="preserve">and wind can produce. With a generator to fall back on, the system doesn’t</w:t>
+      </w:r>
+      <w:r>
+        <w:t xml:space="preserve"> </w:t>
+      </w:r>
+      <w:r>
+        <w:t xml:space="preserve">need a battery big enough to survive on its own — it just needs a battery</w:t>
+      </w:r>
+      <w:r>
+        <w:t xml:space="preserve"> </w:t>
+      </w:r>
+      <w:r>
+        <w:t xml:space="preserve">big enough to be the</w:t>
+      </w:r>
+      <w:r>
+        <w:t xml:space="preserve"> </w:t>
+      </w:r>
+      <w:r>
+        <w:rPr>
+          <w:iCs/>
+          <w:i/>
+        </w:rPr>
+        <w:t xml:space="preserve">cheapest</w:t>
+      </w:r>
+      <w:r>
+        <w:t xml:space="preserve"> </w:t>
+      </w:r>
+      <w:r>
+        <w:t xml:space="preserve">combination of battery and generator fuel.</w:t>
+      </w:r>
+    </w:p>
+    <w:p>
+      <w:pPr>
+        <w:pStyle w:val="BodyText"/>
+      </w:pPr>
+      <w:r>
+        <w:t xml:space="preserve">The results: with a 24-battery-unit system (6,000 kWh), solar and wind</w:t>
+      </w:r>
+      <w:r>
+        <w:t xml:space="preserve"> </w:t>
+      </w:r>
+      <w:r>
+        <w:t xml:space="preserve">cover</w:t>
+      </w:r>
+      <w:r>
+        <w:t xml:space="preserve"> </w:t>
+      </w:r>
+      <w:r>
+        <w:rPr>
+          <w:bCs/>
+          <w:b/>
+        </w:rPr>
+        <w:t xml:space="preserve">74%</w:t>
+      </w:r>
+      <w:r>
+        <w:t xml:space="preserve"> </w:t>
+      </w:r>
+      <w:r>
+        <w:t xml:space="preserve">of the electricity used over the year, the generator covers</w:t>
+      </w:r>
+      <w:r>
+        <w:t xml:space="preserve"> </w:t>
+      </w:r>
+      <w:r>
+        <w:t xml:space="preserve">the other 26%, and far less power goes to waste — down from 60% curtailed</w:t>
+      </w:r>
+      <w:r>
+        <w:t xml:space="preserve"> </w:t>
+      </w:r>
+      <w:r>
+        <w:t xml:space="preserve">to 18%. We also checked, battery size by battery size, where the sweet</w:t>
+      </w:r>
+      <w:r>
+        <w:t xml:space="preserve"> </w:t>
+      </w:r>
+      <w:r>
+        <w:t xml:space="preserve">spot is:</w:t>
+      </w:r>
+      <w:r>
+        <w:t xml:space="preserve"> </w:t>
+      </w:r>
+      <w:r>
+        <w:rPr>
+          <w:bCs/>
+          <w:b/>
+        </w:rPr>
+        <w:t xml:space="preserve">adding battery is worth it up to about 74% renewable power.</w:t>
+      </w:r>
+      <w:r>
+        <w:t xml:space="preserve"> </w:t>
+      </w:r>
+      <w:r>
+        <w:t xml:space="preserve">Below that point, every bit of battery you add saves more in generator</w:t>
+      </w:r>
+      <w:r>
+        <w:t xml:space="preserve"> </w:t>
+      </w:r>
+      <w:r>
+        <w:t xml:space="preserve">fuel than it costs. Beyond that point, it flips — the last bit of battery</w:t>
+      </w:r>
+      <w:r>
+        <w:t xml:space="preserve"> </w:t>
+      </w:r>
+      <w:r>
+        <w:t xml:space="preserve">capacity mostly sits idle waiting for rare, extreme weeks, and costs more</w:t>
+      </w:r>
+      <w:r>
+        <w:t xml:space="preserve"> </w:t>
+      </w:r>
+      <w:r>
+        <w:t xml:space="preserve">than the fuel it saves. Pushing renewable coverage from 74% up toward 80%</w:t>
+      </w:r>
+      <w:r>
+        <w:t xml:space="preserve"> </w:t>
+      </w:r>
+      <w:r>
+        <w:t xml:space="preserve">this way would cost about 30% more per unit of electricity than stopping</w:t>
+      </w:r>
+      <w:r>
+        <w:t xml:space="preserve"> </w:t>
+      </w:r>
+      <w:r>
+        <w:t xml:space="preserve">at the sweet spot, for only a small gain in renewable share.</w:t>
+      </w:r>
+    </w:p>
+    <w:p>
+      <w:pPr>
+        <w:pStyle w:val="BodyText"/>
+      </w:pPr>
+      <w:r>
+        <w:t xml:space="preserve">This is a separate, smaller check — it did not retrain the AI model or</w:t>
+      </w:r>
+      <w:r>
+        <w:t xml:space="preserve"> </w:t>
+      </w:r>
+      <w:r>
+        <w:t xml:space="preserve">regenerate the full 5,000-system dataset described above, both of which</w:t>
+      </w:r>
+      <w:r>
+        <w:t xml:space="preserve"> </w:t>
+      </w:r>
+      <w:r>
+        <w:t xml:space="preserve">remain valid results of the off-grid study. It answers a different,</w:t>
+      </w:r>
+      <w:r>
+        <w:t xml:space="preserve"> </w:t>
+      </w:r>
+      <w:r>
+        <w:t xml:space="preserve">narrower question: for a hybrid system with a generator as backup, how</w:t>
+      </w:r>
+      <w:r>
+        <w:t xml:space="preserve"> </w:t>
+      </w:r>
+      <w:r>
+        <w:t xml:space="preserve">much battery is actually worth paying for.</w:t>
+      </w:r>
+    </w:p>
     <w:bookmarkEnd w:id="24"/>
+    <w:bookmarkEnd w:id="25"/>
     <w:sectPr/>
   </w:body>
 </w:document>

</xml_diff>